<commit_message>
PTAB petition and patent owner response docx: docx/reference.xml on base="xengine" plus Body Keep and pandoc-from markdown+smart-fancy_lists; render.sh's two passes, pagemap and footers move into the filters on fb render's needles (the contents' last row, then each heading with the text after it), FORMBOOK_FOOTERS (the running identification from FORMBOOK_META's patent-number) and FORMBOOK_FINAL; scripts and reference.docx deleted, baseline entries removed; both .docx.pdf byte-identical, check.sh typst and docx 0 failed, XENG-001..003 pass (fb-595.68.3)
</commit_message>
<xml_diff>
--- a/courts/federal-circuit/patent-trial-and-appeal-board/patent-owner-response/usage/OUTPUT-patent-owner-response.docx
+++ b/courts/federal-circuit/patent-trial-and-appeal-board/patent-owner-response/usage/OUTPUT-patent-owner-response.docx
@@ -2818,7 +2818,468 @@
 <w:comments xmlns:w="http://schemas.openxmlformats.org/wordprocessingml/2006/main" xmlns:m="http://schemas.openxmlformats.org/officeDocument/2006/math" xmlns:r="http://schemas.openxmlformats.org/officeDocument/2006/relationships" xmlns:o="urn:schemas-microsoft-com:office:office" xmlns:v="urn:schemas-microsoft-com:vml" xmlns:w10="urn:schemas-microsoft-com:office:word" xmlns:a="http://schemas.openxmlformats.org/drawingml/2006/main" xmlns:pic="http://schemas.openxmlformats.org/drawingml/2006/picture" xmlns:wp="http://schemas.openxmlformats.org/drawingml/2006/wordprocessingDrawing"/>
 </file>
 
-<file path=word/footer-arabic.xml><?xml version="1.0" encoding="utf-8"?>
+<file path=word/footer1.xml><?xml version="1.0" encoding="utf-8"?>
+<w:ftr xmlns:w="http://schemas.openxmlformats.org/wordprocessingml/2006/main" xmlns:r="http://schemas.openxmlformats.org/officeDocument/2006/relationships">
+  <w:p>
+    <w:pPr>
+      <w:jc w:val="center"/>
+    </w:pPr>
+    <w:r>
+      <w:fldChar w:fldCharType="begin"/>
+    </w:r>
+    <w:r>
+      <w:instrText xml:space="preserve"> PAGE </w:instrText>
+    </w:r>
+    <w:r>
+      <w:fldChar w:fldCharType="separate"/>
+    </w:r>
+    <w:r>
+      <w:t>1</w:t>
+    </w:r>
+    <w:r>
+      <w:fldChar w:fldCharType="end"/>
+    </w:r>
+  </w:p>
+</w:ftr>
+</file>
+
+<file path=word/footnotes.xml><?xml version="1.0" encoding="utf-8"?>
+<w:footnotes xmlns:w="http://schemas.openxmlformats.org/wordprocessingml/2006/main" xmlns:m="http://schemas.openxmlformats.org/officeDocument/2006/math" xmlns:r="http://schemas.openxmlformats.org/officeDocument/2006/relationships" xmlns:o="urn:schemas-microsoft-com:office:office" xmlns:v="urn:schemas-microsoft-com:vml" xmlns:w10="urn:schemas-microsoft-com:office:word" xmlns:a="http://schemas.openxmlformats.org/drawingml/2006/main" xmlns:pic="http://schemas.openxmlformats.org/drawingml/2006/picture" xmlns:wp="http://schemas.openxmlformats.org/drawingml/2006/wordprocessingDrawing">
+  <w:footnote w:type="continuationSeparator" w:id="0">
+    <w:p>
+      <w:r>
+        <w:continuationSeparator/>
+      </w:r>
+    </w:p>
+  </w:footnote>
+  <w:footnote w:type="separator" w:id="-1">
+    <w:p>
+      <w:r>
+        <w:separator/>
+      </w:r>
+    </w:p>
+  </w:footnote>
+  <w:footnote w:id="9">
+    <w:p>
+      <w:pPr>
+        <w:pStyle w:val="FootnoteText"/>
+      </w:pPr>
+      <w:r>
+        <w:rPr>
+          <w:rStyle w:val="FootnoteReference"/>
+        </w:rPr>
+        <w:footnoteRef/>
+      </w:r>
+      <w:r>
+        <w:t xml:space="preserve"> </w:t>
+      </w:r>
+      <w:r>
+        <w:t xml:space="preserve">See ’004 Patent, 1:56</w:t>
+      </w:r>
+      <w:r>
+        <w:noBreakHyphen/>
+      </w:r>
+      <w:r>
+        <w:t xml:space="preserve">59.</w:t>
+      </w:r>
+    </w:p>
+  </w:footnote>
+  <w:footnote w:id="10">
+    <w:p>
+      <w:pPr>
+        <w:pStyle w:val="FootnoteText"/>
+      </w:pPr>
+      <w:r>
+        <w:rPr>
+          <w:rStyle w:val="FootnoteReference"/>
+        </w:rPr>
+        <w:footnoteRef/>
+      </w:r>
+      <w:r>
+        <w:t xml:space="preserve"> </w:t>
+      </w:r>
+      <w:r>
+        <w:t xml:space="preserve">Id. 1:61</w:t>
+      </w:r>
+      <w:r>
+        <w:noBreakHyphen/>
+      </w:r>
+      <w:r>
+        <w:t xml:space="preserve">2:3.</w:t>
+      </w:r>
+    </w:p>
+  </w:footnote>
+  <w:footnote w:id="11">
+    <w:p>
+      <w:pPr>
+        <w:pStyle w:val="FootnoteText"/>
+      </w:pPr>
+      <w:r>
+        <w:rPr>
+          <w:rStyle w:val="FootnoteReference"/>
+        </w:rPr>
+        <w:footnoteRef/>
+      </w:r>
+      <w:r>
+        <w:t xml:space="preserve"> </w:t>
+      </w:r>
+      <w:r>
+        <w:t xml:space="preserve">See id. Abstract; see also 1:14</w:t>
+      </w:r>
+      <w:r>
+        <w:noBreakHyphen/>
+      </w:r>
+      <w:r>
+        <w:t xml:space="preserve">18.</w:t>
+      </w:r>
+    </w:p>
+  </w:footnote>
+  <w:footnote w:id="12">
+    <w:p>
+      <w:pPr>
+        <w:pStyle w:val="FootnoteText"/>
+      </w:pPr>
+      <w:r>
+        <w:rPr>
+          <w:rStyle w:val="FootnoteReference"/>
+        </w:rPr>
+        <w:footnoteRef/>
+      </w:r>
+      <w:r>
+        <w:t xml:space="preserve"> </w:t>
+      </w:r>
+      <w:r>
+        <w:t xml:space="preserve">See id. 6:39</w:t>
+      </w:r>
+      <w:r>
+        <w:noBreakHyphen/>
+      </w:r>
+      <w:r>
+        <w:t xml:space="preserve">42.</w:t>
+      </w:r>
+    </w:p>
+  </w:footnote>
+  <w:footnote w:id="13">
+    <w:p>
+      <w:pPr>
+        <w:pStyle w:val="FootnoteText"/>
+      </w:pPr>
+      <w:r>
+        <w:rPr>
+          <w:rStyle w:val="FootnoteReference"/>
+        </w:rPr>
+        <w:footnoteRef/>
+      </w:r>
+      <w:r>
+        <w:t xml:space="preserve"> </w:t>
+      </w:r>
+      <w:r>
+        <w:t xml:space="preserve">Id., 7:8</w:t>
+      </w:r>
+      <w:r>
+        <w:noBreakHyphen/>
+      </w:r>
+      <w:r>
+        <w:t xml:space="preserve">12.</w:t>
+      </w:r>
+    </w:p>
+  </w:footnote>
+  <w:footnote w:id="14">
+    <w:p>
+      <w:pPr>
+        <w:pStyle w:val="FootnoteText"/>
+      </w:pPr>
+      <w:r>
+        <w:rPr>
+          <w:rStyle w:val="FootnoteReference"/>
+        </w:rPr>
+        <w:footnoteRef/>
+      </w:r>
+      <w:r>
+        <w:t xml:space="preserve"> </w:t>
+      </w:r>
+      <w:r>
+        <w:t xml:space="preserve">Id., 7:12</w:t>
+      </w:r>
+      <w:r>
+        <w:noBreakHyphen/>
+      </w:r>
+      <w:r>
+        <w:t xml:space="preserve">16.</w:t>
+      </w:r>
+    </w:p>
+  </w:footnote>
+  <w:footnote w:id="15">
+    <w:p>
+      <w:pPr>
+        <w:pStyle w:val="FootnoteText"/>
+      </w:pPr>
+      <w:r>
+        <w:rPr>
+          <w:rStyle w:val="FootnoteReference"/>
+        </w:rPr>
+        <w:footnoteRef/>
+      </w:r>
+      <w:r>
+        <w:t xml:space="preserve"> </w:t>
+      </w:r>
+      <w:r>
+        <w:t xml:space="preserve">Id., 7:16</w:t>
+      </w:r>
+      <w:r>
+        <w:noBreakHyphen/>
+      </w:r>
+      <w:r>
+        <w:t xml:space="preserve">17.</w:t>
+      </w:r>
+    </w:p>
+  </w:footnote>
+  <w:footnote w:id="16">
+    <w:p>
+      <w:pPr>
+        <w:pStyle w:val="FootnoteText"/>
+      </w:pPr>
+      <w:r>
+        <w:rPr>
+          <w:rStyle w:val="FootnoteReference"/>
+        </w:rPr>
+        <w:footnoteRef/>
+      </w:r>
+      <w:r>
+        <w:t xml:space="preserve"> </w:t>
+      </w:r>
+      <w:r>
+        <w:t xml:space="preserve">Id., 7:37</w:t>
+      </w:r>
+      <w:r>
+        <w:noBreakHyphen/>
+      </w:r>
+      <w:r>
+        <w:t xml:space="preserve">58 and 9:32</w:t>
+      </w:r>
+      <w:r>
+        <w:noBreakHyphen/>
+      </w:r>
+      <w:r>
+        <w:t xml:space="preserve">46.</w:t>
+      </w:r>
+    </w:p>
+  </w:footnote>
+  <w:footnote w:id="17">
+    <w:p>
+      <w:pPr>
+        <w:pStyle w:val="FootnoteText"/>
+      </w:pPr>
+      <w:r>
+        <w:rPr>
+          <w:rStyle w:val="FootnoteReference"/>
+        </w:rPr>
+        <w:footnoteRef/>
+      </w:r>
+      <w:r>
+        <w:t xml:space="preserve"> </w:t>
+      </w:r>
+      <w:r>
+        <w:t xml:space="preserve">Id., 6:42</w:t>
+      </w:r>
+      <w:r>
+        <w:noBreakHyphen/>
+      </w:r>
+      <w:r>
+        <w:t xml:space="preserve">44.</w:t>
+      </w:r>
+    </w:p>
+  </w:footnote>
+  <w:footnote w:id="18">
+    <w:p>
+      <w:pPr>
+        <w:pStyle w:val="FootnoteText"/>
+      </w:pPr>
+      <w:r>
+        <w:rPr>
+          <w:rStyle w:val="FootnoteReference"/>
+        </w:rPr>
+        <w:footnoteRef/>
+      </w:r>
+      <w:r>
+        <w:t xml:space="preserve"> </w:t>
+      </w:r>
+      <w:r>
+        <w:t xml:space="preserve">Id., 2:36</w:t>
+      </w:r>
+      <w:r>
+        <w:noBreakHyphen/>
+      </w:r>
+      <w:r>
+        <w:t xml:space="preserve">40.</w:t>
+      </w:r>
+    </w:p>
+  </w:footnote>
+  <w:footnote w:id="19">
+    <w:p>
+      <w:pPr>
+        <w:pStyle w:val="FootnoteText"/>
+      </w:pPr>
+      <w:r>
+        <w:rPr>
+          <w:rStyle w:val="FootnoteReference"/>
+        </w:rPr>
+        <w:footnoteRef/>
+      </w:r>
+      <w:r>
+        <w:t xml:space="preserve"> </w:t>
+      </w:r>
+      <w:r>
+        <w:t xml:space="preserve">Id. 3:40</w:t>
+      </w:r>
+      <w:r>
+        <w:noBreakHyphen/>
+      </w:r>
+      <w:r>
+        <w:t xml:space="preserve">42.</w:t>
+      </w:r>
+    </w:p>
+  </w:footnote>
+  <w:footnote w:id="20">
+    <w:p>
+      <w:pPr>
+        <w:pStyle w:val="FootnoteText"/>
+      </w:pPr>
+      <w:r>
+        <w:rPr>
+          <w:rStyle w:val="FootnoteReference"/>
+        </w:rPr>
+        <w:footnoteRef/>
+      </w:r>
+      <w:r>
+        <w:t xml:space="preserve"> </w:t>
+      </w:r>
+      <w:r>
+        <w:t xml:space="preserve">Id., 12:25</w:t>
+      </w:r>
+      <w:r>
+        <w:noBreakHyphen/>
+      </w:r>
+      <w:r>
+        <w:t xml:space="preserve">34.</w:t>
+      </w:r>
+    </w:p>
+  </w:footnote>
+  <w:footnote w:id="21">
+    <w:p>
+      <w:pPr>
+        <w:pStyle w:val="FootnoteText"/>
+      </w:pPr>
+      <w:r>
+        <w:rPr>
+          <w:rStyle w:val="FootnoteReference"/>
+        </w:rPr>
+        <w:footnoteRef/>
+      </w:r>
+      <w:r>
+        <w:t xml:space="preserve"> </w:t>
+      </w:r>
+      <w:r>
+        <w:t xml:space="preserve">Corning Inc. v. DSM IP Assets B.V., IPR2013</w:t>
+      </w:r>
+      <w:r>
+        <w:noBreakHyphen/>
+      </w:r>
+      <w:r>
+        <w:t xml:space="preserve">00053, Paper 66 at 19 (PTAB May 1, 2014). See, e.g., Donnelly Garment Co. v. NLRB, 123 F.2d 215, 224 (8th Cir. 1941) (“One who is capable of ruling accurately upon the admissibility of evidence is equally capable of sifting it accurately after it has been received ….”).</w:t>
+      </w:r>
+    </w:p>
+  </w:footnote>
+  <w:footnote w:id="22">
+    <w:p>
+      <w:pPr>
+        <w:pStyle w:val="FootnoteText"/>
+      </w:pPr>
+      <w:r>
+        <w:rPr>
+          <w:rStyle w:val="FootnoteReference"/>
+        </w:rPr>
+        <w:footnoteRef/>
+      </w:r>
+      <w:r>
+        <w:t xml:space="preserve"> </w:t>
+      </w:r>
+      <w:r>
+        <w:t xml:space="preserve">See Ex. 1018 at 2 (“Hall-Ellis Declaration”).</w:t>
+      </w:r>
+    </w:p>
+  </w:footnote>
+</w:footnotes>
+</file>
+
+<file path=word/ftr-add.xml><?xml version="1.0" encoding="utf-8"?>
+<w:ftr xmlns:w="http://schemas.openxmlformats.org/wordprocessingml/2006/main" xmlns:r="http://schemas.openxmlformats.org/officeDocument/2006/relationships">
+  <w:p>
+    <w:pPr>
+      <w:spacing w:before="0" w:after="0"/>
+      <w:jc w:val="center"/>
+    </w:pPr>
+    <w:r>
+      <w:t>Add-</w:t>
+    </w:r>
+    <w:r>
+      <w:fldChar w:fldCharType="begin"/>
+    </w:r>
+    <w:r>
+      <w:instrText xml:space="preserve"> PAGE </w:instrText>
+    </w:r>
+    <w:r>
+      <w:fldChar w:fldCharType="separate"/>
+    </w:r>
+    <w:r>
+      <w:t>1</w:t>
+    </w:r>
+    <w:r>
+      <w:fldChar w:fldCharType="end"/>
+    </w:r>
+  </w:p>
+</w:ftr>
+</file>
+
+<file path=word/ftr-none.xml><?xml version="1.0" encoding="utf-8"?>
+<w:ftr xmlns:w="http://schemas.openxmlformats.org/wordprocessingml/2006/main" xmlns:r="http://schemas.openxmlformats.org/officeDocument/2006/relationships">
+  <w:p>
+    <w:pPr>
+      <w:spacing w:before="0" w:after="0"/>
+      <w:jc w:val="center"/>
+    </w:pPr>
+  </w:p>
+</w:ftr>
+</file>
+
+<file path=word/ftr-own1.xml><?xml version="1.0" encoding="utf-8"?>
+<w:ftr xmlns:w="http://schemas.openxmlformats.org/wordprocessingml/2006/main" xmlns:r="http://schemas.openxmlformats.org/officeDocument/2006/relationships">
+  <w:p>
+    <w:pPr>
+      <w:spacing w:before="0" w:after="0" w:line="320" w:lineRule="exact"/>
+      <w:ind w:left="0" w:firstLine="0"/>
+      <w:jc w:val="center"/>
+    </w:pPr>
+    <w:r>
+      <w:fldChar w:fldCharType="begin"/>
+    </w:r>
+    <w:r>
+      <w:instrText xml:space="preserve"> PAGE </w:instrText>
+    </w:r>
+    <w:r>
+      <w:fldChar w:fldCharType="separate"/>
+    </w:r>
+    <w:r>
+      <w:t>1</w:t>
+    </w:r>
+    <w:r>
+      <w:fldChar w:fldCharType="end"/>
+    </w:r>
+  </w:p>
+</w:ftr>
+</file>
+
+<file path=word/ftr-own2.xml><?xml version="1.0" encoding="utf-8"?>
 <w:ftr xmlns:w="http://schemas.openxmlformats.org/wordprocessingml/2006/main" xmlns:r="http://schemas.openxmlformats.org/officeDocument/2006/relationships">
   <w:p>
     <w:pPr>
@@ -2855,12 +3316,11 @@
 </w:ftr>
 </file>
 
-<file path=word/footer-roman.xml><?xml version="1.0" encoding="utf-8"?>
+<file path=word/ftr-page.xml><?xml version="1.0" encoding="utf-8"?>
 <w:ftr xmlns:w="http://schemas.openxmlformats.org/wordprocessingml/2006/main" xmlns:r="http://schemas.openxmlformats.org/officeDocument/2006/relationships">
   <w:p>
     <w:pPr>
-      <w:spacing w:before="0" w:after="0" w:line="320" w:lineRule="exact"/>
-      <w:ind w:left="0" w:firstLine="0"/>
+      <w:spacing w:before="0" w:after="0"/>
       <w:jc w:val="center"/>
     </w:pPr>
     <w:r>
@@ -2880,400 +3340,6 @@
     </w:r>
   </w:p>
 </w:ftr>
-</file>
-
-<file path=word/footer1.xml><?xml version="1.0" encoding="utf-8"?>
-<w:ftr xmlns:w="http://schemas.openxmlformats.org/wordprocessingml/2006/main" xmlns:r="http://schemas.openxmlformats.org/officeDocument/2006/relationships">
-  <w:p>
-    <w:pPr>
-      <w:jc w:val="center"/>
-    </w:pPr>
-    <w:r>
-      <w:fldChar w:fldCharType="begin"/>
-    </w:r>
-    <w:r>
-      <w:instrText xml:space="preserve"> PAGE </w:instrText>
-    </w:r>
-    <w:r>
-      <w:fldChar w:fldCharType="separate"/>
-    </w:r>
-    <w:r>
-      <w:t>1</w:t>
-    </w:r>
-    <w:r>
-      <w:fldChar w:fldCharType="end"/>
-    </w:r>
-  </w:p>
-</w:ftr>
-</file>
-
-<file path=word/footnotes.xml><?xml version="1.0" encoding="utf-8"?>
-<w:footnotes xmlns:w="http://schemas.openxmlformats.org/wordprocessingml/2006/main" xmlns:m="http://schemas.openxmlformats.org/officeDocument/2006/math" xmlns:r="http://schemas.openxmlformats.org/officeDocument/2006/relationships" xmlns:o="urn:schemas-microsoft-com:office:office" xmlns:v="urn:schemas-microsoft-com:vml" xmlns:w10="urn:schemas-microsoft-com:office:word" xmlns:a="http://schemas.openxmlformats.org/drawingml/2006/main" xmlns:pic="http://schemas.openxmlformats.org/drawingml/2006/picture" xmlns:wp="http://schemas.openxmlformats.org/drawingml/2006/wordprocessingDrawing">
-  <w:footnote w:type="continuationSeparator" w:id="0">
-    <w:p>
-      <w:r>
-        <w:continuationSeparator/>
-      </w:r>
-    </w:p>
-  </w:footnote>
-  <w:footnote w:type="separator" w:id="-1">
-    <w:p>
-      <w:r>
-        <w:separator/>
-      </w:r>
-    </w:p>
-  </w:footnote>
-  <w:footnote w:id="9">
-    <w:p>
-      <w:pPr>
-        <w:pStyle w:val="FootnoteText"/>
-      </w:pPr>
-      <w:r>
-        <w:rPr>
-          <w:rStyle w:val="FootnoteReference"/>
-        </w:rPr>
-        <w:footnoteRef/>
-      </w:r>
-      <w:r>
-        <w:t xml:space="preserve"> </w:t>
-      </w:r>
-      <w:r>
-        <w:t xml:space="preserve">See ’004 Patent, 1:56</w:t>
-      </w:r>
-      <w:r>
-        <w:noBreakHyphen/>
-      </w:r>
-      <w:r>
-        <w:t xml:space="preserve">59.</w:t>
-      </w:r>
-    </w:p>
-  </w:footnote>
-  <w:footnote w:id="10">
-    <w:p>
-      <w:pPr>
-        <w:pStyle w:val="FootnoteText"/>
-      </w:pPr>
-      <w:r>
-        <w:rPr>
-          <w:rStyle w:val="FootnoteReference"/>
-        </w:rPr>
-        <w:footnoteRef/>
-      </w:r>
-      <w:r>
-        <w:t xml:space="preserve"> </w:t>
-      </w:r>
-      <w:r>
-        <w:t xml:space="preserve">Id. 1:61</w:t>
-      </w:r>
-      <w:r>
-        <w:noBreakHyphen/>
-      </w:r>
-      <w:r>
-        <w:t xml:space="preserve">2:3.</w:t>
-      </w:r>
-    </w:p>
-  </w:footnote>
-  <w:footnote w:id="11">
-    <w:p>
-      <w:pPr>
-        <w:pStyle w:val="FootnoteText"/>
-      </w:pPr>
-      <w:r>
-        <w:rPr>
-          <w:rStyle w:val="FootnoteReference"/>
-        </w:rPr>
-        <w:footnoteRef/>
-      </w:r>
-      <w:r>
-        <w:t xml:space="preserve"> </w:t>
-      </w:r>
-      <w:r>
-        <w:t xml:space="preserve">See id. Abstract; see also 1:14</w:t>
-      </w:r>
-      <w:r>
-        <w:noBreakHyphen/>
-      </w:r>
-      <w:r>
-        <w:t xml:space="preserve">18.</w:t>
-      </w:r>
-    </w:p>
-  </w:footnote>
-  <w:footnote w:id="12">
-    <w:p>
-      <w:pPr>
-        <w:pStyle w:val="FootnoteText"/>
-      </w:pPr>
-      <w:r>
-        <w:rPr>
-          <w:rStyle w:val="FootnoteReference"/>
-        </w:rPr>
-        <w:footnoteRef/>
-      </w:r>
-      <w:r>
-        <w:t xml:space="preserve"> </w:t>
-      </w:r>
-      <w:r>
-        <w:t xml:space="preserve">See id. 6:39</w:t>
-      </w:r>
-      <w:r>
-        <w:noBreakHyphen/>
-      </w:r>
-      <w:r>
-        <w:t xml:space="preserve">42.</w:t>
-      </w:r>
-    </w:p>
-  </w:footnote>
-  <w:footnote w:id="13">
-    <w:p>
-      <w:pPr>
-        <w:pStyle w:val="FootnoteText"/>
-      </w:pPr>
-      <w:r>
-        <w:rPr>
-          <w:rStyle w:val="FootnoteReference"/>
-        </w:rPr>
-        <w:footnoteRef/>
-      </w:r>
-      <w:r>
-        <w:t xml:space="preserve"> </w:t>
-      </w:r>
-      <w:r>
-        <w:t xml:space="preserve">Id., 7:8</w:t>
-      </w:r>
-      <w:r>
-        <w:noBreakHyphen/>
-      </w:r>
-      <w:r>
-        <w:t xml:space="preserve">12.</w:t>
-      </w:r>
-    </w:p>
-  </w:footnote>
-  <w:footnote w:id="14">
-    <w:p>
-      <w:pPr>
-        <w:pStyle w:val="FootnoteText"/>
-      </w:pPr>
-      <w:r>
-        <w:rPr>
-          <w:rStyle w:val="FootnoteReference"/>
-        </w:rPr>
-        <w:footnoteRef/>
-      </w:r>
-      <w:r>
-        <w:t xml:space="preserve"> </w:t>
-      </w:r>
-      <w:r>
-        <w:t xml:space="preserve">Id., 7:12</w:t>
-      </w:r>
-      <w:r>
-        <w:noBreakHyphen/>
-      </w:r>
-      <w:r>
-        <w:t xml:space="preserve">16.</w:t>
-      </w:r>
-    </w:p>
-  </w:footnote>
-  <w:footnote w:id="15">
-    <w:p>
-      <w:pPr>
-        <w:pStyle w:val="FootnoteText"/>
-      </w:pPr>
-      <w:r>
-        <w:rPr>
-          <w:rStyle w:val="FootnoteReference"/>
-        </w:rPr>
-        <w:footnoteRef/>
-      </w:r>
-      <w:r>
-        <w:t xml:space="preserve"> </w:t>
-      </w:r>
-      <w:r>
-        <w:t xml:space="preserve">Id., 7:16</w:t>
-      </w:r>
-      <w:r>
-        <w:noBreakHyphen/>
-      </w:r>
-      <w:r>
-        <w:t xml:space="preserve">17.</w:t>
-      </w:r>
-    </w:p>
-  </w:footnote>
-  <w:footnote w:id="16">
-    <w:p>
-      <w:pPr>
-        <w:pStyle w:val="FootnoteText"/>
-      </w:pPr>
-      <w:r>
-        <w:rPr>
-          <w:rStyle w:val="FootnoteReference"/>
-        </w:rPr>
-        <w:footnoteRef/>
-      </w:r>
-      <w:r>
-        <w:t xml:space="preserve"> </w:t>
-      </w:r>
-      <w:r>
-        <w:t xml:space="preserve">Id., 7:37</w:t>
-      </w:r>
-      <w:r>
-        <w:noBreakHyphen/>
-      </w:r>
-      <w:r>
-        <w:t xml:space="preserve">58 and 9:32</w:t>
-      </w:r>
-      <w:r>
-        <w:noBreakHyphen/>
-      </w:r>
-      <w:r>
-        <w:t xml:space="preserve">46.</w:t>
-      </w:r>
-    </w:p>
-  </w:footnote>
-  <w:footnote w:id="17">
-    <w:p>
-      <w:pPr>
-        <w:pStyle w:val="FootnoteText"/>
-      </w:pPr>
-      <w:r>
-        <w:rPr>
-          <w:rStyle w:val="FootnoteReference"/>
-        </w:rPr>
-        <w:footnoteRef/>
-      </w:r>
-      <w:r>
-        <w:t xml:space="preserve"> </w:t>
-      </w:r>
-      <w:r>
-        <w:t xml:space="preserve">Id., 6:42</w:t>
-      </w:r>
-      <w:r>
-        <w:noBreakHyphen/>
-      </w:r>
-      <w:r>
-        <w:t xml:space="preserve">44.</w:t>
-      </w:r>
-    </w:p>
-  </w:footnote>
-  <w:footnote w:id="18">
-    <w:p>
-      <w:pPr>
-        <w:pStyle w:val="FootnoteText"/>
-      </w:pPr>
-      <w:r>
-        <w:rPr>
-          <w:rStyle w:val="FootnoteReference"/>
-        </w:rPr>
-        <w:footnoteRef/>
-      </w:r>
-      <w:r>
-        <w:t xml:space="preserve"> </w:t>
-      </w:r>
-      <w:r>
-        <w:t xml:space="preserve">Id., 2:36</w:t>
-      </w:r>
-      <w:r>
-        <w:noBreakHyphen/>
-      </w:r>
-      <w:r>
-        <w:t xml:space="preserve">40.</w:t>
-      </w:r>
-    </w:p>
-  </w:footnote>
-  <w:footnote w:id="19">
-    <w:p>
-      <w:pPr>
-        <w:pStyle w:val="FootnoteText"/>
-      </w:pPr>
-      <w:r>
-        <w:rPr>
-          <w:rStyle w:val="FootnoteReference"/>
-        </w:rPr>
-        <w:footnoteRef/>
-      </w:r>
-      <w:r>
-        <w:t xml:space="preserve"> </w:t>
-      </w:r>
-      <w:r>
-        <w:t xml:space="preserve">Id. 3:40</w:t>
-      </w:r>
-      <w:r>
-        <w:noBreakHyphen/>
-      </w:r>
-      <w:r>
-        <w:t xml:space="preserve">42.</w:t>
-      </w:r>
-    </w:p>
-  </w:footnote>
-  <w:footnote w:id="20">
-    <w:p>
-      <w:pPr>
-        <w:pStyle w:val="FootnoteText"/>
-      </w:pPr>
-      <w:r>
-        <w:rPr>
-          <w:rStyle w:val="FootnoteReference"/>
-        </w:rPr>
-        <w:footnoteRef/>
-      </w:r>
-      <w:r>
-        <w:t xml:space="preserve"> </w:t>
-      </w:r>
-      <w:r>
-        <w:t xml:space="preserve">Id., 12:25</w:t>
-      </w:r>
-      <w:r>
-        <w:noBreakHyphen/>
-      </w:r>
-      <w:r>
-        <w:t xml:space="preserve">34.</w:t>
-      </w:r>
-    </w:p>
-  </w:footnote>
-  <w:footnote w:id="21">
-    <w:p>
-      <w:pPr>
-        <w:pStyle w:val="FootnoteText"/>
-      </w:pPr>
-      <w:r>
-        <w:rPr>
-          <w:rStyle w:val="FootnoteReference"/>
-        </w:rPr>
-        <w:footnoteRef/>
-      </w:r>
-      <w:r>
-        <w:t xml:space="preserve"> </w:t>
-      </w:r>
-      <w:r>
-        <w:t xml:space="preserve">Corning Inc. v. DSM IP Assets B.V., IPR2013</w:t>
-      </w:r>
-      <w:r>
-        <w:noBreakHyphen/>
-      </w:r>
-      <w:r>
-        <w:t xml:space="preserve">00053, Paper 66 at 19 (PTAB May 1, 2014). See, e.g., Donnelly Garment Co. v. NLRB, 123 F.2d 215, 224 (8th Cir. 1941) (“One who is capable of ruling accurately upon the admissibility of evidence is equally capable of sifting it accurately after it has been received ….”).</w:t>
-      </w:r>
-    </w:p>
-  </w:footnote>
-  <w:footnote w:id="22">
-    <w:p>
-      <w:pPr>
-        <w:pStyle w:val="FootnoteText"/>
-      </w:pPr>
-      <w:r>
-        <w:rPr>
-          <w:rStyle w:val="FootnoteReference"/>
-        </w:rPr>
-        <w:footnoteRef/>
-      </w:r>
-      <w:r>
-        <w:t xml:space="preserve"> </w:t>
-      </w:r>
-      <w:r>
-        <w:t xml:space="preserve">See Ex. 1018 at 2 (“Hall-Ellis Declaration”).</w:t>
-      </w:r>
-    </w:p>
-  </w:footnote>
-</w:footnotes>
 </file>
 
 <file path=word/numbering.xml><?xml version="1.0" encoding="utf-8"?>

</xml_diff>